<commit_message>
tổng hợp các lab lại
</commit_message>
<xml_diff>
--- a/LAB1/1250080021_NguyenThanhCan_CNPM1_LAB01.docx
+++ b/LAB1/1250080021_NguyenThanhCan_CNPM1_LAB01.docx
@@ -30595,23 +30595,16 @@
         <w:widowControl w:val="0"/>
         <w:autoSpaceDE w:val="0"/>
         <w:autoSpaceDN w:val="0"/>
-        <w:spacing w:before="183" w:after="0" w:line="240" w:lineRule="auto"/>
+        <w:spacing w:after="0" w:line="240" w:lineRule="auto"/>
         <w:ind w:left="143"/>
-      </w:pPr>
-      <w:r>
-        <w:rPr>
-          <w:rFonts w:ascii="Times New Roman" w:eastAsia="Times New Roman" w:hAnsi="Times New Roman" w:cs="Times New Roman"/>
-          <w:noProof/>
-          <w:kern w:val="0"/>
-          <w:sz w:val="26"/>
-          <w:szCs w:val="26"/>
-          <w14:ligatures w14:val="none"/>
-        </w:rPr>
+        <w:jc w:val="center"/>
+      </w:pPr>
+      <w:r>
         <w:drawing>
-          <wp:inline distT="0" distB="0" distL="0" distR="0" wp14:anchorId="48AC22C1" wp14:editId="7D59C86C">
-            <wp:extent cx="6091369" cy="5382322"/>
-            <wp:effectExtent l="0" t="0" r="5080" b="0"/>
-            <wp:docPr id="2139188475" name="Picture 6"/>
+          <wp:inline distT="0" distB="0" distL="0" distR="0" wp14:anchorId="29C1B9B3" wp14:editId="2FB498A4">
+            <wp:extent cx="5980430" cy="5486400"/>
+            <wp:effectExtent l="0" t="0" r="1270" b="0"/>
+            <wp:docPr id="14101566" name="Picture 3"/>
             <wp:cNvGraphicFramePr>
               <a:graphicFrameLocks xmlns:a="http://schemas.openxmlformats.org/drawingml/2006/main" noChangeAspect="1"/>
             </wp:cNvGraphicFramePr>
@@ -30619,7 +30612,7 @@
               <a:graphicData uri="http://schemas.openxmlformats.org/drawingml/2006/picture">
                 <pic:pic xmlns:pic="http://schemas.openxmlformats.org/drawingml/2006/picture">
                   <pic:nvPicPr>
-                    <pic:cNvPr id="0" name="Picture 16"/>
+                    <pic:cNvPr id="0" name="Picture 6"/>
                     <pic:cNvPicPr>
                       <a:picLocks noChangeAspect="1" noChangeArrowheads="1"/>
                     </pic:cNvPicPr>
@@ -30640,7 +30633,7 @@
                   <pic:spPr bwMode="auto">
                     <a:xfrm>
                       <a:off x="0" y="0"/>
-                      <a:ext cx="6139282" cy="5424657"/>
+                      <a:ext cx="6003718" cy="5507764"/>
                     </a:xfrm>
                     <a:prstGeom prst="rect">
                       <a:avLst/>
@@ -30659,6 +30652,17 @@
     </w:p>
     <w:p>
       <w:pPr>
+        <w:keepNext/>
+        <w:widowControl w:val="0"/>
+        <w:autoSpaceDE w:val="0"/>
+        <w:autoSpaceDN w:val="0"/>
+        <w:spacing w:after="0" w:line="240" w:lineRule="auto"/>
+        <w:ind w:left="143"/>
+        <w:jc w:val="center"/>
+      </w:pPr>
+    </w:p>
+    <w:p>
+      <w:pPr>
         <w:pStyle w:val="Caption"/>
         <w:jc w:val="center"/>
         <w:rPr>
@@ -30675,7 +30679,7 @@
           <w:sz w:val="26"/>
           <w:szCs w:val="26"/>
         </w:rPr>
-        <w:t>Sơ đồ use case  hệ thông thư viện trực tuyến</w:t>
+        <w:t>Hình 1. Sơ đồ Use Case hệ thống thư viện trực tuyến</w:t>
       </w:r>
     </w:p>
     <w:p>
@@ -44202,7 +44206,6 @@
   <w:style w:type="character" w:default="1" w:styleId="DefaultParagraphFont">
     <w:name w:val="Default Paragraph Font"/>
     <w:uiPriority w:val="1"/>
-    <w:semiHidden/>
     <w:unhideWhenUsed/>
   </w:style>
   <w:style w:type="table" w:default="1" w:styleId="TableNormal">

</xml_diff>